<commit_message>
esboço das entidades principais do projeto
</commit_message>
<xml_diff>
--- a/Conceptualizacão de Sistema de Gestão de uma Agência Musical.docx
+++ b/Conceptualizacão de Sistema de Gestão de uma Agência Musical.docx
@@ -119,64 +119,149 @@
     </w:p>
     <w:p>
       <w:pPr>
-        <w:rPr>
-          <w:b/>
-          <w:bCs/>
-        </w:rPr>
-      </w:pPr>
-      <w:r>
-        <w:rPr>
-          <w:b/>
-          <w:bCs/>
+        <w:pStyle w:val="Subttulo"/>
+        <w:rPr>
+          <w:rFonts w:eastAsiaTheme="minorHAnsi" w:cstheme="minorBidi"/>
+          <w:b/>
+          <w:bCs/>
+          <w:color w:val="auto"/>
+          <w:spacing w:val="0"/>
+          <w:sz w:val="24"/>
+          <w:szCs w:val="24"/>
+        </w:rPr>
+      </w:pPr>
+      <w:r>
+        <w:rPr>
+          <w:rFonts w:eastAsiaTheme="minorHAnsi" w:cstheme="minorBidi"/>
+          <w:b/>
+          <w:bCs/>
+          <w:color w:val="auto"/>
+          <w:spacing w:val="0"/>
+          <w:sz w:val="24"/>
+          <w:szCs w:val="24"/>
         </w:rPr>
         <w:t>Bandas</w:t>
       </w:r>
     </w:p>
     <w:p>
-      <w:r>
-        <w:t>As bandas serão a entidade principal do sistema. Cada registo poderá incluir campos como ID, nome da banda, género musical, cidade, contacto, email, número de membros, disponibilidade e estado de registo.</w:t>
-      </w:r>
-    </w:p>
-    <w:p>
-      <w:pPr>
-        <w:rPr>
-          <w:b/>
-          <w:bCs/>
-        </w:rPr>
-      </w:pPr>
-      <w:r>
-        <w:rPr>
-          <w:b/>
-          <w:bCs/>
+      <w:pPr>
+        <w:pStyle w:val="Subttulo"/>
+        <w:rPr>
+          <w:rFonts w:eastAsiaTheme="minorHAnsi" w:cstheme="minorBidi"/>
+          <w:color w:val="auto"/>
+          <w:spacing w:val="0"/>
+          <w:sz w:val="24"/>
+          <w:szCs w:val="24"/>
+        </w:rPr>
+      </w:pPr>
+      <w:r>
+        <w:rPr>
+          <w:rFonts w:eastAsiaTheme="minorHAnsi" w:cstheme="minorBidi"/>
+          <w:color w:val="auto"/>
+          <w:spacing w:val="0"/>
+          <w:sz w:val="24"/>
+          <w:szCs w:val="24"/>
+        </w:rPr>
+        <w:t>As bandas serão a entidade principal do sistema. Cada registo representará uma banda ou artista individual e incluirá informação essencial como ID, nome, número de membros, género musical, contacto, email e disponibilidade. A disponibilidade será usada para indicar se o registo se encontra apto para marcações, permitindo uma gestão simples e organizada da informação.</w:t>
+      </w:r>
+    </w:p>
+    <w:p>
+      <w:pPr>
+        <w:pStyle w:val="Subttulo"/>
+        <w:rPr>
+          <w:rFonts w:eastAsiaTheme="minorHAnsi" w:cstheme="minorBidi"/>
+          <w:b/>
+          <w:bCs/>
+          <w:color w:val="auto"/>
+          <w:spacing w:val="0"/>
+          <w:sz w:val="24"/>
+          <w:szCs w:val="24"/>
+        </w:rPr>
+      </w:pPr>
+      <w:r>
+        <w:rPr>
+          <w:rFonts w:eastAsiaTheme="minorHAnsi" w:cstheme="minorBidi"/>
+          <w:b/>
+          <w:bCs/>
+          <w:color w:val="auto"/>
+          <w:spacing w:val="0"/>
+          <w:sz w:val="24"/>
+          <w:szCs w:val="24"/>
         </w:rPr>
         <w:t>Eventos</w:t>
       </w:r>
     </w:p>
     <w:p>
-      <w:r>
-        <w:t>Os eventos representarão os espetáculos ou atuações onde as bandas poderão ser marcadas. Cada evento poderá ter ID, nome do evento, local, data, cachet, tipo de evento e estado.</w:t>
-      </w:r>
-    </w:p>
-    <w:p>
-      <w:pPr>
-        <w:rPr>
-          <w:b/>
-          <w:bCs/>
-        </w:rPr>
-      </w:pPr>
-      <w:r>
-        <w:rPr>
-          <w:b/>
-          <w:bCs/>
+      <w:pPr>
+        <w:pStyle w:val="Subttulo"/>
+        <w:rPr>
+          <w:rFonts w:eastAsiaTheme="minorHAnsi" w:cstheme="minorBidi"/>
+          <w:color w:val="auto"/>
+          <w:spacing w:val="0"/>
+          <w:sz w:val="24"/>
+          <w:szCs w:val="24"/>
+        </w:rPr>
+      </w:pPr>
+      <w:r>
+        <w:rPr>
+          <w:rFonts w:eastAsiaTheme="minorHAnsi" w:cstheme="minorBidi"/>
+          <w:color w:val="auto"/>
+          <w:spacing w:val="0"/>
+          <w:sz w:val="24"/>
+          <w:szCs w:val="24"/>
+        </w:rPr>
+        <w:t>Os eventos serão registados como espetáculos ou atuações da agência. Cada evento poderá conter ID, nome do evento, local, data, cachet, tipo de evento e estado do evento, servindo como base para posterior ligação às bandas através das marcações.</w:t>
+      </w:r>
+    </w:p>
+    <w:p>
+      <w:pPr>
+        <w:pStyle w:val="Subttulo"/>
+        <w:rPr>
+          <w:rFonts w:eastAsiaTheme="minorHAnsi" w:cstheme="minorBidi"/>
+          <w:b/>
+          <w:bCs/>
+          <w:color w:val="auto"/>
+          <w:spacing w:val="0"/>
+          <w:sz w:val="24"/>
+          <w:szCs w:val="24"/>
+        </w:rPr>
+      </w:pPr>
+      <w:r>
+        <w:rPr>
+          <w:rFonts w:eastAsiaTheme="minorHAnsi" w:cstheme="minorBidi"/>
+          <w:b/>
+          <w:bCs/>
+          <w:color w:val="auto"/>
+          <w:spacing w:val="0"/>
+          <w:sz w:val="24"/>
+          <w:szCs w:val="24"/>
         </w:rPr>
         <w:t>Marcações</w:t>
       </w:r>
     </w:p>
     <w:p>
-      <w:r>
-        <w:t>As marcações serão usadas para associar uma banda a um evento. Este registo poderá conter ID, banda associada, evento associado, data da marcação, estado da confirmação e observações.</w:t>
-      </w:r>
-    </w:p>
+      <w:pPr>
+        <w:pStyle w:val="Subttulo"/>
+        <w:rPr>
+          <w:rFonts w:eastAsiaTheme="minorHAnsi" w:cstheme="minorBidi"/>
+          <w:color w:val="auto"/>
+          <w:spacing w:val="0"/>
+          <w:sz w:val="24"/>
+          <w:szCs w:val="24"/>
+        </w:rPr>
+      </w:pPr>
+      <w:r>
+        <w:rPr>
+          <w:rFonts w:eastAsiaTheme="minorHAnsi" w:cstheme="minorBidi"/>
+          <w:color w:val="auto"/>
+          <w:spacing w:val="0"/>
+          <w:sz w:val="24"/>
+          <w:szCs w:val="24"/>
+        </w:rPr>
+        <w:t>As marcações representam a ligação entre bandas e eventos na agência musical. Cada registo inclui um identificador, a banda associada, o evento associado, a data da marcação, o estado da confirmação e observações relevantes, garantindo o controlo da informação de forma simples e estruturada.</w:t>
+      </w:r>
+    </w:p>
+    <w:p/>
     <w:p>
       <w:pPr>
         <w:pStyle w:val="Subttulo"/>
@@ -282,6 +367,7 @@
         <w:pStyle w:val="Subttulo"/>
       </w:pPr>
       <w:r>
+        <w:lastRenderedPageBreak/>
         <w:t>6. Estrutura dos dados</w:t>
       </w:r>
     </w:p>
@@ -297,11 +383,7 @@
         <w:t>listas de dicionários</w:t>
       </w:r>
       <w:r>
-        <w:t xml:space="preserve">, uma vez que esta estrutura é simples, prática e adequada para guardar registos em JSON. Cada lista </w:t>
-      </w:r>
-      <w:r>
-        <w:lastRenderedPageBreak/>
-        <w:t>irá conter vários dicionários, onde cada dicionário representa uma banda, um evento ou uma marcação.</w:t>
+        <w:t>, uma vez que esta estrutura é simples, prática e adequada para guardar registos em JSON. Cada lista irá conter vários dicionários, onde cada dicionário representa uma banda, um evento ou uma marcação.</w:t>
       </w:r>
     </w:p>
     <w:p>
@@ -468,6 +550,7 @@
     </w:p>
     <w:p>
       <w:r>
+        <w:lastRenderedPageBreak/>
         <w:t>Adicionar mecanismos de pesquisa e ordenação por campos como nome, data ou estado.</w:t>
       </w:r>
     </w:p>
@@ -488,7 +571,6 @@
     </w:p>
     <w:p>
       <w:r>
-        <w:lastRenderedPageBreak/>
         <w:t>Implementar validações com expressões regulares para email, telefone e data.</w:t>
       </w:r>
     </w:p>

</xml_diff>